<commit_message>
feat(db): migra banco local de Dexie/IndexedDB para SQLite via Prisma
- 27 tabelas em prisma/schema.prisma; Prisma 6 no processo main (userData/aurum.db, WAL)
- renderer via IPC db:op/db:snapshot (allowlist, tetos, revalidacao); fallback memoria so no web puro
- validacao de dominio em toda escrita + tipos/constraints do Prisma
- seed transacional por lote (createMany pos-clear, upsert com retry); bulkPut em lotes de 500
- bootstrap de schema em runtime (DDL embarcado), integrity_check + quarentena no boot
- portao de base completa nas 5 nucleares com autocura (reseed)
- snapshot pre-restore (.pre-restore.bak) e pre-update (versionado); backup cobre as 27 stores (KEK/resumos fora)
- fail-closed no renderer empacotado sem ponte do banco
- build: motores win+mac, asarUnpack, db:generate/prebuild, portao [4b/5] no verificar-build
- README atualizado; suíte: 154 arquivos / 1740 testes verdes; tsc limpo
</commit_message>
<xml_diff>
--- a/docs/CONTRATO - Aurum Tax NCM (Licenca de Uso Desktop Local).docx
+++ b/docs/CONTRATO - Aurum Tax NCM (Licenca de Uso Desktop Local).docx
@@ -24,7 +24,7 @@
           <w:color w:val="555555"/>
           <w:sz w:val="20"/>
         </w:rPr>
-        <w:t>Licença de uso local (instalação na máquina do cliente) · Sem armazenamento em nuvem · Versão 1.0 — Setembro/2026</w:t>
+        <w:t>Licença de uso local (instalação na máquina do cliente) · Sem armazenamento em nuvem · Versão 1.1 — Outubro/2026</w:t>
       </w:r>
     </w:p>
     <w:p>
@@ -84,7 +84,15 @@
         <w:jc w:val="both"/>
       </w:pPr>
       <w:r>
-        <w:t>CONSIDERANDO que a CONTRATADA é a titular dos direitos sobre o software Aurum Tax NCM, programa de computador desktop (Windows/Linux/macOS via Electron) de classificação e análise fiscal da Reforma Tributária, que auxilia na classificação de NCM/NBS, definição de CST de IBS/CBS e cClassTrib, simulação de cálculos, importação e análise de SPED Fiscal e de XMLs de NF-e/NFC-e, gestão de produtos e emissão de relatórios;</w:t>
+        <w:t>CONSIDERANDO que a CONTRATADA é a titular dos direitos sobre o software Aurum Tax NCM, programa de computador desktop (Windows/Linux/macOS via Electron) de classificação e análise fiscal da Reforma Tributária, que auxilia na classificação de NCM/NBS, definição de CST de IBS/CBS e cClassTrib, simulação de cálculos (incluindo Simples Nacional com projeção dividida v2 e segregação), importação e análise de XMLs de NF-e/NFC-e, gestão de empresas e produtos e emissão de relatórios; o motor de SPED Fiscal roda localmente sem tela dedicada e a classificação é 100% determinística local (índice lexical + resolvedor oficial + grafo fiscal), sem modelo de linguagem embutido, sem chat dedicado e sem mascote;</w:t>
+      </w:r>
+    </w:p>
+    <w:p>
+      <w:pPr>
+        <w:jc w:val="both"/>
+      </w:pPr>
+      <w:r>
+        <w:t>CONSIDERANDO que esta versão 1.1 (Out/2026) substitui a versão 1.0 (Set/2026) e reflete o software como ele é hoje — 10 módulos (Calculadora, Simples Nacional, Consulta NCM, Serviços NBS, Consulta de CNAEs, Classificação em lote, Notas Fiscais XML, Produtos, Tabelas Auxiliares e Legislação) — exigindo novo aceite único após a atualização;</w:t>
       </w:r>
     </w:p>
     <w:p>
@@ -150,7 +158,7 @@
         <w:t xml:space="preserve">“Software” ou “Aurum Tax NCM”: </w:t>
       </w:r>
       <w:r>
-        <w:t>“Software” ou “Aurum Tax NCM”: o programa de computador desktop, seus módulos (Calculadora Tributária, Consulta NCM, Classificação individual e em lote, SPED Fiscal, Notas Fiscais XML, Produtos, Tabelas Auxiliares e Legislação), bases de dados embutidas, documentação e atualizações fornecidas pela CONTRATADA sob a marca Aurum Tax NCM.</w:t>
+        <w:t>“Software” ou “Aurum Tax NCM”: o programa de computador desktop, seus 10 módulos (Calculadora Tributária, Simples Nacional com projeção dividida v2 e segregação, Consulta NCM, Serviços NBS, Consulta de CNAEs, Classificação individual e em lote, Notas Fiscais XML com layouts Polida e Clássica, Produtos e Empresas, Tabelas Auxiliares e Legislação), bases de dados embutidas, documentação e atualizações fornecidas pela CONTRATADA sob a marca Aurum Tax NCM. Não integram o Software: chat dedicado, mascote virtual ou modelo de linguagem embutido.</w:t>
       </w:r>
     </w:p>
     <w:p>
@@ -248,7 +256,7 @@
         <w:jc w:val="both"/>
       </w:pPr>
       <w:r>
-        <w:t>2.2. Conforme a versão adquirida, o Software abrange: (i) calculadora de IBS/CBS; (ii) consulta de NCM com classificações da Reforma (CST, cClassTrib, base legal e trechos da legislação); (iii) classificação individual e em lote (CSV/Excel); (iv) importação e análise de SPED Fiscal; (v) importação e análise de XMLs de NF-e/NFC-e; (vi) cadastro e gestão de empresas e produtos; (vii) tabelas auxiliares editáveis (CST, cClassTrib, NCM, CFOP, CST ICMS, CST PIS/COFINS); (viii) módulo de legislação com links oficiais; e (ix) exportação de relatórios em PDF/planilha. O escopo efetivo é o descrito na Proposta/Pedido e na versão instalada.</w:t>
+        <w:t>2.2. Conforme a versão adquirida, o Software abrange: (i) calculadora de IBS/CBS; (ii) Simples Nacional com DAS por Anexo I–V, Fator R, sublimite, duelo Convencional × Híbrido, relatório analítico e projeção dividida v2 com segregação; (iii) consulta de NCM com classificações da Reforma (CST, cClassTrib, base legal e trechos da legislação); (iv) serviços NBS e consulta de CNAEs; (v) classificação individual e em lote (CSV/Excel); (vi) importação e análise de XMLs de NF-e/NFC-e com layouts Polida e Clássica; (vii) cadastro e gestão de empresas e produtos; (viii) tabelas auxiliares editáveis (CST, cClassTrib, NCM, CFOP, CST ICMS, CST PIS/COFINS); (ix) módulo de legislação com links oficiais; e (x) exportação de relatórios em PDF/planilha. O motor de SPED Fiscal roda localmente sem tela dedicada. O escopo efetivo é o descrito na Proposta/Pedido e na versão instalada.</w:t>
       </w:r>
     </w:p>
     <w:p>
@@ -458,7 +466,7 @@
         <w:t xml:space="preserve">Destaque — sem nuvem: </w:t>
       </w:r>
       <w:r>
-        <w:t>5.1. O Aurum Tax NCM é um software desktop de processamento e armazenamento locais. Todos os dados operacionais da CONTRATANTE — empresas, produtos, SPED, XMLs de notas, classificações, reclassificações manuais, emitente e tabelas auxiliares — são gravados exclusivamente na máquina da CONTRATANTE (banco local IndexedDB/Dexie no perfil da aplicação, pasta de dados do usuário — userData/xml — e chaves de localStorage da aplicação), e NÃO são enviados, hospedados, replicados ou armazenados em nuvem pela CONTRATADA.</w:t>
+        <w:t>5.1. O Aurum Tax NCM é um software desktop de processamento e armazenamento locais. Todos os dados operacionais da CONTRATANTE — empresas, produtos, XMLs de notas, classificações, reclassificações manuais, emitente e tabelas auxiliares — são gravados exclusivamente na máquina da CONTRATANTE (banco local IndexedDB/Dexie no perfil da aplicação, pasta de dados do usuário — userData/xml — e chaves de localStorage da aplicação), e NÃO são enviados, hospedados, replicados ou armazenados em nuvem pela CONTRATADA. A classificação é determinística local (índice lexical + resolvedor oficial + grafo fiscal com fallback lexical); não há modelo de linguagem embutido, chat dedicado ou telemetria.</w:t>
       </w:r>
     </w:p>
     <w:p>
@@ -466,7 +474,7 @@
         <w:jc w:val="both"/>
       </w:pPr>
       <w:r>
-        <w:t>5.2. A CONTRATADA NÃO tem acesso, NÃO coleta, NÃO visualiza e NÃO trata os dados operacionais inseridos pela CONTRATANTE no Software. Não há conta em nuvem, painel administrativo remoto ou telemetria da base de dados. Por consequência, a CONTRATADA não atua como operadora desses dados para fins da LGPD — o tratamento ocorre exclusivamente no ambiente e sob o controle da CONTRATANTE.</w:t>
+        <w:t>5.2. A CONTRATADA NÃO tem acesso, NÃO coleta, NÃO visualiza e NÃO trata os dados operacionais inseridos pela CONTRATANTE no Software. Não há conta em nuvem, painel administrativo remoto ou telemetria da base de dados. Por consequência, a CONTRATADA não atua como operadora desses dados para fins da LGPD — o tratamento ocorre exclusivamente no ambiente e sob o controle da CONTRATANTE. O tour guiado menu a menu é apenas conteúdo local de onboarding, sem coleta.</w:t>
       </w:r>
     </w:p>
     <w:p>
@@ -482,7 +490,7 @@
         <w:jc w:val="both"/>
       </w:pPr>
       <w:r>
-        <w:t>5.4. Conexão à internet é necessária apenas para as funções opcionais do item 5.3 e para baixar atualizações. Todas as funções essenciais de classificação, cálculo, SPED, XML, produtos e relatórios operam offline após a instalação.</w:t>
+        <w:t>5.4. Conexão à internet é necessária apenas para as funções opcionais do item 5.3 e para baixar atualizações. Todas as funções essenciais de classificação, cálculo, Simples, lote, XML, produtos e relatórios operam offline após a instalação.</w:t>
       </w:r>
     </w:p>
     <w:p>
@@ -1136,7 +1144,7 @@
         <w:jc w:val="both"/>
       </w:pPr>
       <w:r>
-        <w:t>1. Licença de uso do Aurum Tax NCM, software desktop da Aurum Bit Labs &amp; Studios LTDA, nos limites da versão adquirida;</w:t>
+        <w:t>1. Licença de uso do Aurum Tax NCM v1.1 (Out/2026), software desktop da Aurum Bit Labs &amp; Studios LTDA, nos limites da versão adquirida: 10 módulos — Calculadora, Simples Nacional (+ projeção dividida v2), Consulta NCM, Serviços (NBS), Consulta de CNAEs, Lote, XML de NF-e/NFC-e, Produtos, Tabelas auxiliares e Legislação;</w:t>
       </w:r>
     </w:p>
     <w:p>
@@ -1145,7 +1153,16 @@
         <w:jc w:val="both"/>
       </w:pPr>
       <w:r>
-        <w:t>2. O software roda 100% na sua máquina. NÃO armazenamos seus dados em nuvem: empresas, produtos, SPED, XMLs e classificações ficam somente no seu computador (banco local + pasta de dados do usuário). A Aurum não recebe nem tem acesso à sua base;</w:t>
+        <w:t>2. O software roda 100% na sua máquina. NÃO armazenamos seus dados em nuvem: empresas, produtos, XMLs e classificações ficam somente no seu computador (banco local + pasta de dados do usuário). A Aurum não recebe nem tem acesso à sua base. Classificação determinística local, sem IA em nuvem e sem chat dedicado;</w:t>
+      </w:r>
+    </w:p>
+    <w:p>
+      <w:pPr>
+        <w:pStyle w:val="ListBullet"/>
+        <w:jc w:val="both"/>
+      </w:pPr>
+      <w:r>
+        <w:t>3. Motor SPED local sem tela dedicada — a importação com interface é a de XML de NF-e/NFC-e. Internet apenas para funções opcionais (consulta de CNPJ via BrasilAPI, leitura de normas oficiais Planalto/CGIBS, portal CFF e verificação de atualizações) — sua base nunca é enviada à Aurum;</w:t>
       </w:r>
     </w:p>
     <w:p>

</xml_diff>